<commit_message>
Synchronize Clinical Privacy Policy Engine documentation
</commit_message>
<xml_diff>
--- a/docs/architecture/MedNexus_Enterprise_Architecture_and_Engineering_Blueprint_v1.2.docx
+++ b/docs/architecture/MedNexus_Enterprise_Architecture_and_Engineering_Blueprint_v1.2.docx
@@ -225,7 +225,7 @@
           </w:tcPr>
           <w:p>
             <w:r>
-              <w:t>De-identification Intelligence Core validated baseline — 645 tests passed</w:t>
+              <w:t>Clinical Privacy Policy Engine validated baseline — 671 tests passed</w:t>
             </w:r>
           </w:p>
         </w:tc>
@@ -290,7 +290,7 @@
           </w:tcPr>
           <w:p>
             <w:r>
-              <w:t>Architecture Baseline + De-identification Intelligence Core Integrated and Validated</w:t>
+              <w:t>Unified Intelligence + Purpose-Based Policy Engine Integrated and Validated</w:t>
             </w:r>
           </w:p>
         </w:tc>
@@ -322,7 +322,7 @@
           </w:tcPr>
           <w:p>
             <w:r>
-              <w:t>9 August 2026</w:t>
+              <w:t>10 August 2026</w:t>
             </w:r>
           </w:p>
         </w:tc>
@@ -489,7 +489,7 @@
     </w:p>
     <w:p>
       <w:r>
-        <w:t>18. Immediate Engineering Plan — Updated 9 August 2026</w:t>
+        <w:t>18. Immediate Engineering Plan — Updated 10 August 2026</w:t>
       </w:r>
     </w:p>
     <w:p>
@@ -523,7 +523,7 @@
     </w:p>
     <w:p>
       <w:r>
-        <w:t>The project has progressed beyond the early Build 0008/0009 architecture prototype described in the original baseline. The current De-identification implementation now includes a MedNexus-owned Intelligence Core, deterministic identifier detection, role and context validation, detection merging, orchestration, and final output construction integrated into the real DeidentificationService. OpenMed remains an external candidate detector only; its deidentified_text is not authoritative. MedNexus owns the final privacy decision and constructs the final de-identified output. The current full regression baseline is 645 passed tests with 8 warnings and no failures. This is strong Phase 1 engineering evidence, but it is not a claim of production certification; real clinical documents will continue to expose additional cases that must be handled within the fixed architecture rather than through uncontrolled report-specific patching.</w:t>
+        <w:t>The current De-identification capability is implemented as a Clinical Privacy Policy Engine, not merely an anonymizer. Its authoritative flow is Detection → Unified Intelligence → Purpose-Based Policy Engine → MedNexusOutputBuilder → MedNexus-owned output. Context-rule, deterministic, and OpenMed candidates converge through one Intelligence pipeline. OpenMed remains candidate-only and its deidentified_text is non-authoritative. The verified regression baseline is 671 passed tests, 8 warnings, and no failures. This is strong Phase 1 engineering evidence, not production certification.</w:t>
       </w:r>
     </w:p>
     <w:p>
@@ -2039,7 +2039,7 @@
     </w:p>
     <w:p>
       <w:r>
-        <w:t>OpenMed is a foundational external engine in the current prototype. MedNexus uses it through an adapter and adds value around it: document handling, policy control, context-aware protection, validation, orchestration, provenance, multiple-engine selection, and enterprise integration.</w:t>
+        <w:t>OpenMed is a replaceable external candidate detector in the current implementation. MedNexus uses it through an adapter; OpenMed output must pass through unified intelligence, purpose-based policy resolution, and MedNexus-owned output construction.</w:t>
       </w:r>
     </w:p>
     <w:p>
@@ -2421,10 +2421,7 @@
           </w:tcPr>
           <w:p>
             <w:r>
-              <w:rPr>
-                <w:sz w:val="18"/>
-              </w:rPr>
-              <w:t>Default, research, and strict privacy behaviors</w:t>
+              <w:t>Four canonical purpose profiles with PolicyRule/PolicyDefinition and legacy aliases</w:t>
             </w:r>
           </w:p>
         </w:tc>
@@ -2435,10 +2432,7 @@
           </w:tcPr>
           <w:p>
             <w:r>
-              <w:rPr>
-                <w:sz w:val="18"/>
-              </w:rPr>
-              <w:t>Strong product direction.</w:t>
+              <w:t>Clinical, Research, Analytics/Public Health, and Strict Privacy use one policy resolver and pipeline.</w:t>
             </w:r>
           </w:p>
         </w:tc>
@@ -2598,7 +2592,7 @@
           </w:tcPr>
           <w:p>
             <w:r>
-              <w:t>Full regression suite: 645 passed, 8 warnings, 0 failures</w:t>
+              <w:t>Full regression suite: 671 passed, 8 warnings, 0 failures</w:t>
             </w:r>
           </w:p>
         </w:tc>
@@ -2609,7 +2603,7 @@
           </w:tcPr>
           <w:p>
             <w:r>
-              <w:t>Strong current regression baseline; formal benchmark metrics and real-world production validation remain future gates.</w:t>
+              <w:t>Strong current baseline; production certification and formal privacy/utility risk assessment remain future gates.</w:t>
             </w:r>
           </w:p>
         </w:tc>
@@ -2843,7 +2837,7 @@
         <w:pStyle w:val="ListBullet"/>
       </w:pPr>
       <w:r>
-        <w:t>The policy profile concept supports different use cases such as operational privacy and research.</w:t>
+        <w:t>PolicyRule and PolicyDefinition provide an extensible purpose-based policy model with Clinical, Research, Analytics/Public Health, and Strict Privacy profiles.</w:t>
       </w:r>
     </w:p>
     <w:p>
@@ -2880,7 +2874,7 @@
     </w:p>
     <w:p>
       <w:r>
-        <w:t>The current codebase is best classified as a validated alpha engineering foundation for the De-identification intelligence path. The core logic and architecture operate end-to-end in the real service and have a 645-test regression baseline. TXT, DOCX, and text-based PDF ingestion are implemented through the unified document extraction architecture and file upload/de-identification API. This does not constitute production certification. The next objective is to finish and verify the surrounding end-to-end document-processing and benchmark gates while preserving the validated Intelligence Core, then proceed to Document Understanding and Clinical Extraction.</w:t>
+        <w:t>The current codebase is a validated alpha foundation for the Clinical Privacy Policy Engine. Text and TXT/DOCX/text-based PDF paths use the same policy resolver and authoritative pipeline, with a 671-test regression baseline. This does not constitute production certification. The next immediate product milestone is the MedNexus Frontend Redesign / Policy Experience.</w:t>
       </w:r>
     </w:p>
     <w:p>
@@ -3107,10 +3101,7 @@
           </w:tcPr>
           <w:p>
             <w:r>
-              <w:rPr>
-                <w:sz w:val="18"/>
-              </w:rPr>
-              <w:t>PolicyTransformer accepts objects, dictionaries, tuples, and legacy regex fallback.</w:t>
+              <w:t>PolicyTransformer and its legacy regex fallback remain as compatibility code outside the authoritative service path.</w:t>
             </w:r>
           </w:p>
         </w:tc>
@@ -3121,7 +3112,7 @@
           </w:tcPr>
           <w:p>
             <w:r>
-              <w:t>Detection and final decision ownership have moved into the MedNexus intelligence pipeline.</w:t>
+              <w:t>No production privacy decision depends on the compatibility transformer.</w:t>
             </w:r>
           </w:p>
         </w:tc>
@@ -3132,7 +3123,7 @@
           </w:tcPr>
           <w:p>
             <w:r>
-              <w:t>Keep transformation separate from candidate detection and external-engine output.</w:t>
+              <w:t>Retain only for compatibility until removal is separately approved.</w:t>
             </w:r>
           </w:p>
         </w:tc>
@@ -4745,10 +4736,7 @@
           </w:tcPr>
           <w:p>
             <w:r>
-              <w:rPr>
-                <w:sz w:val="18"/>
-              </w:rPr>
-              <w:t>Replace, hash, mask, shift, remove, or keep.</w:t>
+              <w:t>Apply implemented actions: keep, replace, hash, mask, or remove. Advanced transformations remain planned.</w:t>
             </w:r>
           </w:p>
         </w:tc>
@@ -5460,7 +5448,7 @@
     </w:p>
     <w:p>
       <w:r>
-        <w:t>Rules are not rejected. They are constrained to tasks where deterministic logic is strong: syntax, known identifiers, field delimiters, and validation. AI is used where semantic generalization is required. A missed entity should first be classified as a detector coverage issue, model issue, mapping issue, merger issue, or policy issue. It must not automatically result in a new exception inside PolicyTransformer.</w:t>
+        <w:t>Rules are constrained to tasks where deterministic logic is strong: syntax, known identifiers, field delimiters, and validation. AI is used where semantic generalization is required. A missed entity must be classified as a detection, canonicalization, role/context, merger, policy, output, or ingestion issue; it must not create a second privacy pipeline or report-specific transformation fallback.</w:t>
       </w:r>
     </w:p>
     <w:p>
@@ -7853,10 +7841,7 @@
           </w:tcPr>
           <w:p>
             <w:r>
-              <w:rPr>
-                <w:sz w:val="18"/>
-              </w:rPr>
-              <w:t>Unified detection contract, hybrid detection orchestration, privacy policies, stable API, text plus TXT/DOCX/PDF ingestion, benchmark framework.</w:t>
+              <w:t>Unified intelligence, purpose-based Clinical Privacy Policy Engine, stable APIs, text plus TXT/DOCX/PDF ingestion, and benchmark foundation.</w:t>
             </w:r>
           </w:p>
         </w:tc>
@@ -8298,12 +8283,12 @@
     </w:p>
     <w:p>
       <w:r>
-        <w:t>✔ Current regression baseline: 645 tests passed, 8 warnings, 0 failures</w:t>
-      </w:r>
-    </w:p>
-    <w:p>
-      <w:r>
-        <w:t>Current clarification (9 August 2026): the De-identification Intelligence Core, current text workflow, and TXT/DOCX/text-based PDF ingestion path are implemented. The file-processing service routes extracted text into the same MedNexus-owned intelligence pipeline. Representative synthetic/controlled report validation does not equal production certification. Phase 1 product exit remains dependent on completion of the planned end-to-end benchmark gates and later validation with governed real clinical documents. Scanned/image PDF OCR is not yet implemented.</w:t>
+        <w:t>✔ Current regression baseline: 671 tests passed, 8 warnings, 0 failures</w:t>
+      </w:r>
+    </w:p>
+    <w:p>
+      <w:r>
+        <w:t>Current clarification (10 August 2026): context-rule, deterministic, and OpenMed candidates converge through one Intelligence pipeline. PolicyTransformer and KeepEntityProtector remain compatibility components outside the authoritative service path. Both text and file APIs select the same purpose profile through one resolver. Representative validation does not equal production certification; scanned/image PDF OCR remains unimplemented.</w:t>
       </w:r>
     </w:p>
     <w:p>
@@ -8534,12 +8519,12 @@
         <w:pStyle w:val="Heading1"/>
       </w:pPr>
       <w:r>
-        <w:t>18. Immediate Engineering Plan — Updated 9 August 2026</w:t>
-      </w:r>
-    </w:p>
-    <w:p>
-      <w:r>
-        <w:t>The original Build 0008 refactoring plan has been completed for the current De-identification intelligence path. The immediate priority is no longer to redesign detection. The priority is to preserve the validated logic, complete the surrounding end-to-end processing pipeline, and then advance according to the fixed roadmap.</w:t>
+        <w:t>18. Immediate Engineering Plan — Updated 10 August 2026</w:t>
+      </w:r>
+    </w:p>
+    <w:p>
+      <w:r>
+        <w:t>The Unified Privacy Decision Pipeline and Purpose-Based Clinical Privacy Policy Engine POC Milestone 1 are complete. The immediate product priority is the MedNexus Frontend Redesign / Policy Experience while preserving the authoritative pipeline and policy semantics.</w:t>
       </w:r>
     </w:p>
     <w:p>
@@ -8572,13 +8557,7 @@
         <w:pStyle w:val="ListNumber"/>
       </w:pPr>
       <w:r>
-        <w:t>Pass the unified detection list through DeidentificationService into PolicyTransformer.</w:t>
-      </w:r>
-      <w:r>
-        <w:rPr>
-          <w:color w:val="00B050"/>
-        </w:rPr>
-        <w:t xml:space="preserve"> Status: Completed</w:t>
+        <w:t>Route unified candidates through the Intelligence Core into PolicyDefinition/PolicyEngine and MedNexusOutputBuilder. Status: Completed</w:t>
       </w:r>
     </w:p>
     <w:p>
@@ -8586,13 +8565,7 @@
         <w:pStyle w:val="ListNumber"/>
       </w:pPr>
       <w:r>
-        <w:t>Refactor PolicyTransformer to transform detected entities only; retain legacy fallback temporarily behind an explicit compatibility flag.</w:t>
-      </w:r>
-      <w:r>
-        <w:rPr>
-          <w:color w:val="00B050"/>
-        </w:rPr>
-        <w:t xml:space="preserve"> Status: Completed</w:t>
+        <w:t>Remove PolicyTransformer from the authoritative service path; retain it only as a compatibility component. Status: Completed</w:t>
       </w:r>
     </w:p>
     <w:p>
@@ -8600,13 +8573,7 @@
         <w:pStyle w:val="ListNumber"/>
       </w:pPr>
       <w:r>
-        <w:t>Remove the independent transformable-entity whitelist after policy applicability is centralized.</w:t>
-      </w:r>
-      <w:r>
-        <w:rPr>
-          <w:color w:val="00B050"/>
-        </w:rPr>
-        <w:t xml:space="preserve"> Status: Completed</w:t>
+        <w:t>Centralize purpose-based policy applicability in typed PolicyRule and PolicyDefinition contracts. Status: Completed</w:t>
       </w:r>
     </w:p>
     <w:p>
@@ -8815,7 +8782,7 @@
         <w:jc w:val="both"/>
       </w:pPr>
       <w:r>
-        <w:t>✔ Superseded by current regression baseline: 645 tests passed, 8 warnings, 0 failures</w:t>
+        <w:t>✔ Superseded by current regression baseline: 671 tests passed, 8 warnings, 0 failures</w:t>
       </w:r>
     </w:p>
     <w:p>
@@ -9588,6 +9555,50 @@
           </w:p>
         </w:tc>
       </w:tr>
+      <w:tr>
+        <w:tc>
+          <w:tcPr>
+            <w:tcW w:type="dxa" w:w="1710"/>
+          </w:tcPr>
+          <w:p>
+            <w:r>
+              <w:t>AD-19</w:t>
+            </w:r>
+          </w:p>
+        </w:tc>
+        <w:tc>
+          <w:tcPr>
+            <w:tcW w:type="dxa" w:w="8370"/>
+          </w:tcPr>
+          <w:p>
+            <w:r>
+              <w:t>Purpose-of-use policies and regulatory frameworks remain separate; custom policies reuse the unified privacy pipeline.</w:t>
+            </w:r>
+          </w:p>
+        </w:tc>
+      </w:tr>
+      <w:tr>
+        <w:tc>
+          <w:tcPr>
+            <w:tcW w:type="dxa" w:w="1710"/>
+          </w:tcPr>
+          <w:p>
+            <w:r>
+              <w:t>AD-20</w:t>
+            </w:r>
+          </w:p>
+        </w:tc>
+        <w:tc>
+          <w:tcPr>
+            <w:tcW w:type="dxa" w:w="8370"/>
+          </w:tcPr>
+          <w:p>
+            <w:r>
+              <w:t>Only KEEP, REPLACE, HASH, MASK, and REMOVE are currently implemented; advanced transformations and privacy/utility risk capabilities remain planned until genuinely implemented and validated.</w:t>
+            </w:r>
+          </w:p>
+        </w:tc>
+      </w:tr>
     </w:tbl>
     <w:p/>
     <w:p>
@@ -9600,7 +9611,7 @@
     </w:p>
     <w:p>
       <w:r>
-        <w:t>As of 9 August 2026, the implemented Intelligence Core includes MedNexusCandidateEntity, EntityCanonicalizer, OpenMedCandidateAdapter, RoleResolver, ContextValidator, DetectionMerger, MedNexusIntelligenceOrchestrator, and MedNexusOutputBuilder. Deterministic identifier detection is integrated into DeidentificationService. Representative validation has covered Radiology, Emergency, Discharge Summary, Pathology, Laboratory, Referral, Operative Note, Notification Form, Death Certificate, Admission, and ICU examples. Recent deterministic extensions include phone numbers, record checksums, Arabic patient/deceased names, electronic signature IDs, form identifiers, and medical license identifiers. A known minor output-normalization debt remains for adjacent/repeated relative-name placeholders; it is not currently classified as a known privacy failure.</w:t>
+        <w:t>As of 10 August 2026, MedNexus De-identification is a purpose-based Clinical Privacy Policy Engine. PolicyRule and PolicyDefinition support four canonical profiles: MEDNEXUS_CLINICAL, MEDNEXUS_RESEARCH, MEDNEXUS_ANALYTICS_PUBLIC_HEALTH, and MEDNEXUS_STRICT_PRIVACY. Implemented transformations are KEEP, REPLACE, HASH, MASK, and REMOVE. GENERALIZE, SHIFT_DATE, age/age-band derivation, geographic generalization, pseudonymization/tokenization, Privacy–Utility assessment, Residual Re-identification Risk assessment, and the Custom Policy Builder are planned, not implemented. The future model must distinguish direct identifiers, quasi-identifiers, clinical attributes, and contextual or analytical attributes. Purpose-of-use policies remain conceptually separate from regulatory frameworks, and custom policies must reuse the unified pipeline.</w:t>
       </w:r>
     </w:p>
     <w:p>
@@ -9618,7 +9629,7 @@
     </w:p>
     <w:p>
       <w:r>
-        <w:t>MedNexus now contains a validated working De-identification intelligence base and an implemented TXT/DOCX/text-based PDF ingestion and file-processing path. The correct continuation is to protect this baseline, finish and verify the end-to-end document-processing and benchmark gates, and then expand into Document Understanding, Clinical Extraction, Terminology Services, Structured Data, and Analytics according to the fixed roadmap. New real-world failures should be classified as detector, canonicalization, role/context, merger, policy, output, or ingestion/extraction issues and solved within the MedNexus architecture rather than by allowing an external engine or report-specific patch to become authoritative.</w:t>
+        <w:t>MedNexus now contains a validated Clinical Privacy Policy Engine and an implemented TXT/DOCX/text-based PDF ingestion path. The next immediate milestone is the Frontend Redesign / Policy Experience. The planned Custom Policy Builder is a major product differentiator, but it must configure the same unified pipeline rather than create a parallel privacy path.</w:t>
       </w:r>
     </w:p>
     <w:p>
@@ -9678,7 +9689,7 @@
     </w:p>
     <w:p>
       <w:r>
-        <w:t>✔ Historical baseline superseded by current regression baseline: 645 tests passed</w:t>
+        <w:t>✔ Historical baseline superseded by current regression baseline: 671 tests passed</w:t>
       </w:r>
     </w:p>
     <w:p>

</xml_diff>